<commit_message>
actualizacion de archivos de entrega
</commit_message>
<xml_diff>
--- a/Fase_1/Evidencias_Individuales/RUBILAR_VICTOR_1.3_APT122_AutoevaluacionFase1.docx
+++ b/Fase_1/Evidencias_Individuales/RUBILAR_VICTOR_1.3_APT122_AutoevaluacionFase1.docx
@@ -9273,7 +9273,7 @@
               <w:bottom w:val="single" w:sz="4" w:space="0" w:color="auto"/>
               <w:right w:val="single" w:sz="4" w:space="0" w:color="auto"/>
             </w:tcBorders>
-            <w:shd w:val="clear" w:color="auto" w:fill="9CC2E5" w:themeFill="accent1" w:themeFillTint="99"/>
+            <w:shd w:val="clear" w:color="auto" w:fill="2E74B5" w:themeFill="accent1" w:themeFillShade="BF"/>
             <w:vAlign w:val="center"/>
             <w:hideMark/>
           </w:tcPr>
@@ -9309,7 +9309,7 @@
               <w:bottom w:val="single" w:sz="4" w:space="0" w:color="auto"/>
               <w:right w:val="single" w:sz="4" w:space="0" w:color="auto"/>
             </w:tcBorders>
-            <w:shd w:val="clear" w:color="auto" w:fill="9CC2E5" w:themeFill="accent1" w:themeFillTint="99"/>
+            <w:shd w:val="clear" w:color="auto" w:fill="2E74B5" w:themeFill="accent1" w:themeFillShade="BF"/>
             <w:vAlign w:val="center"/>
             <w:hideMark/>
           </w:tcPr>
@@ -9345,7 +9345,7 @@
               <w:bottom w:val="single" w:sz="4" w:space="0" w:color="auto"/>
               <w:right w:val="single" w:sz="4" w:space="0" w:color="auto"/>
             </w:tcBorders>
-            <w:shd w:val="clear" w:color="auto" w:fill="9CC2E5" w:themeFill="accent1" w:themeFillTint="99"/>
+            <w:shd w:val="clear" w:color="auto" w:fill="2E74B5" w:themeFill="accent1" w:themeFillShade="BF"/>
             <w:vAlign w:val="center"/>
             <w:hideMark/>
           </w:tcPr>

</xml_diff>